<commit_message>
Updated ePortfolio with second enhancement
</commit_message>
<xml_diff>
--- a/artifacts/Enhancement 2/Enhancement Narrative.docx
+++ b/artifacts/Enhancement 2/Enhancement Narrative.docx
@@ -223,7 +223,21 @@
         <w:rPr>
           <w:rFonts w:ascii="Calibri" w:hAnsi="Calibri" w:cs="Calibri"/>
         </w:rPr>
-        <w:t xml:space="preserve"> search, but will be implemented for OwnerID and </w:t>
+        <w:t xml:space="preserve"> </w:t>
+      </w:r>
+      <w:proofErr w:type="gramStart"/>
+      <w:r>
+        <w:rPr>
+          <w:rFonts w:ascii="Calibri" w:hAnsi="Calibri" w:cs="Calibri"/>
+        </w:rPr>
+        <w:t>search, but</w:t>
+      </w:r>
+      <w:proofErr w:type="gramEnd"/>
+      <w:r>
+        <w:rPr>
+          <w:rFonts w:ascii="Calibri" w:hAnsi="Calibri" w:cs="Calibri"/>
+        </w:rPr>
+        <w:t xml:space="preserve"> will be implemented for OwnerID and </w:t>
       </w:r>
       <w:proofErr w:type="spellStart"/>
       <w:r>
@@ -343,15 +357,35 @@
           <w:i/>
           <w:iCs/>
         </w:rPr>
-        <w:t>olved in design choices.</w:t>
-      </w:r>
-      <w:r>
-        <w:rPr>
-          <w:rFonts w:ascii="Calibri" w:hAnsi="Calibri" w:cs="Calibri"/>
-          <w:b/>
-          <w:bCs/>
-        </w:rPr>
-        <w:t xml:space="preserve">“ </w:t>
+        <w:t xml:space="preserve">olved in design </w:t>
+      </w:r>
+      <w:proofErr w:type="gramStart"/>
+      <w:r>
+        <w:rPr>
+          <w:rFonts w:ascii="Calibri" w:hAnsi="Calibri" w:cs="Calibri"/>
+          <w:b/>
+          <w:bCs/>
+          <w:i/>
+          <w:iCs/>
+        </w:rPr>
+        <w:t>choices.</w:t>
+      </w:r>
+      <w:r>
+        <w:rPr>
+          <w:rFonts w:ascii="Calibri" w:hAnsi="Calibri" w:cs="Calibri"/>
+          <w:b/>
+          <w:bCs/>
+        </w:rPr>
+        <w:t>“</w:t>
+      </w:r>
+      <w:proofErr w:type="gramEnd"/>
+      <w:r>
+        <w:rPr>
+          <w:rFonts w:ascii="Calibri" w:hAnsi="Calibri" w:cs="Calibri"/>
+          <w:b/>
+          <w:bCs/>
+        </w:rPr>
+        <w:t xml:space="preserve"> </w:t>
       </w:r>
     </w:p>
     <w:p>
@@ -399,8 +433,9 @@
           <w:i/>
           <w:iCs/>
         </w:rPr>
-        <w:t>Demonstrate an ability to use well-founded and innovative techniques, skills, and tools in computing practices for the purpose of implementing computer solutions that deliver value and accomplish industry-specific goals.</w:t>
-      </w:r>
+        <w:t xml:space="preserve">Demonstrate an ability to use well-founded and innovative techniques, skills, and tools in computing practices for the purpose of implementing computer solutions that deliver value and accomplish industry-specific </w:t>
+      </w:r>
+      <w:proofErr w:type="gramStart"/>
       <w:r>
         <w:rPr>
           <w:rFonts w:ascii="Calibri" w:hAnsi="Calibri" w:cs="Calibri"/>
@@ -409,8 +444,19 @@
           <w:i/>
           <w:iCs/>
         </w:rPr>
+        <w:t>goals.</w:t>
+      </w:r>
+      <w:r>
+        <w:rPr>
+          <w:rFonts w:ascii="Calibri" w:hAnsi="Calibri" w:cs="Calibri"/>
+          <w:b/>
+          <w:bCs/>
+          <w:i/>
+          <w:iCs/>
+        </w:rPr>
         <w:t>“</w:t>
       </w:r>
+      <w:proofErr w:type="gramEnd"/>
     </w:p>
     <w:p>
       <w:pPr>
@@ -457,7 +503,21 @@
         <w:rPr>
           <w:rFonts w:ascii="Calibri" w:hAnsi="Calibri" w:cs="Calibri"/>
         </w:rPr>
-        <w:t xml:space="preserve">The second outcome was fully met by this enhancement and will continue to be supported going forward with my use of industry tools like Swing for the GUI, Maven for dependency management, and JUnit for testing. While I found myself running out of time this week to really write up some tests (scope creep is real), it is implemented with the hopes I can get some proper tests written in the coming weeks. Combining these tools with the data structures and repository pattern, I created a responsive, maintainable, and scalable application. By integrating algorithmic logic within the repository layer and maintaining smooth interaction between the Swing GUI and the underlying SQLite database, I showed that I can apply established computing solutions using tools available to me to build efficient, maintainable solutions that align with industry standards. At this time, I do not feel I need to update my outcome coverage plan as I am on track to meet all the course outcomes by the time I finish enhancing my artifact. </w:t>
+        <w:t xml:space="preserve">The second outcome was fully met by this enhancement and will continue to be supported going forward with my use of industry tools like Swing for the GUI, Maven for dependency management, and JUnit for testing. While I found myself running out of time this week to really write up some tests (scope creep is real), it is implemented with the hopes I can get some proper tests written in the coming weeks. Combining these tools with the data structures and repository pattern, I created a responsive, maintainable, and scalable application. By integrating algorithmic logic within the repository layer and maintaining smooth interaction between the Swing GUI and the underlying SQLite database, I showed that I can apply established computing solutions using tools available to me to build efficient, maintainable solutions that align with industry standards. </w:t>
+      </w:r>
+      <w:proofErr w:type="gramStart"/>
+      <w:r>
+        <w:rPr>
+          <w:rFonts w:ascii="Calibri" w:hAnsi="Calibri" w:cs="Calibri"/>
+        </w:rPr>
+        <w:t>At this time</w:t>
+      </w:r>
+      <w:proofErr w:type="gramEnd"/>
+      <w:r>
+        <w:rPr>
+          <w:rFonts w:ascii="Calibri" w:hAnsi="Calibri" w:cs="Calibri"/>
+        </w:rPr>
+        <w:t xml:space="preserve">, I do not feel I need to update my outcome coverage plan as I am on track to meet all the course outcomes by the time I finish enhancing my artifact. </w:t>
       </w:r>
     </w:p>
     <w:p>
@@ -477,7 +537,49 @@
         <w:rPr>
           <w:rFonts w:ascii="Calibri" w:hAnsi="Calibri" w:cs="Calibri"/>
         </w:rPr>
-        <w:t xml:space="preserve">Working through this weeks enhancements taught me a great deal about the importance of keeping a growing project organized with well-defined layers and functions. As I introduced new algorithms and data structures, I had to carefully refactor the existing code from a last week to ensure each responsibility stayed in its proper place. The repository logic stayed with the repository layer, the database operations stayed in their respective DAOs, and all presentation concerns stayed within the Swing GUI. The biggest challenge was maintaining clean code while adding more complex in-memory structures and ensuring they stayed synchronized with the SQLite database. It was very easy for logic to become tangled as I added more features, so I had to be really thoughtful about enforcing separation of concerns and keeping functions focused and cohesive, </w:t>
+        <w:t xml:space="preserve">Working through this </w:t>
+      </w:r>
+      <w:proofErr w:type="gramStart"/>
+      <w:r>
+        <w:rPr>
+          <w:rFonts w:ascii="Calibri" w:hAnsi="Calibri" w:cs="Calibri"/>
+        </w:rPr>
+        <w:t>weeks</w:t>
+      </w:r>
+      <w:proofErr w:type="gramEnd"/>
+      <w:r>
+        <w:rPr>
+          <w:rFonts w:ascii="Calibri" w:hAnsi="Calibri" w:cs="Calibri"/>
+        </w:rPr>
+        <w:t xml:space="preserve"> enhancements taught me a great deal about the importance of keeping a growing project organized with well-defined layers and functions. As I introduced new algorithms and data structures, I had to carefully refactor the existing code from </w:t>
+      </w:r>
+      <w:proofErr w:type="gramStart"/>
+      <w:r>
+        <w:rPr>
+          <w:rFonts w:ascii="Calibri" w:hAnsi="Calibri" w:cs="Calibri"/>
+        </w:rPr>
+        <w:t>a last</w:t>
+      </w:r>
+      <w:proofErr w:type="gramEnd"/>
+      <w:r>
+        <w:rPr>
+          <w:rFonts w:ascii="Calibri" w:hAnsi="Calibri" w:cs="Calibri"/>
+        </w:rPr>
+        <w:t xml:space="preserve"> week to ensure each responsibility stayed in its proper place. The repository logic stayed with the repository layer, the database operations stayed in their respective DAOs, and all presentation concerns stayed within the Swing GUI. The biggest challenge was maintaining clean code while adding more complex in-memory structures and ensuring they stayed synchronized with the SQLite database. It was very easy for logic to become tangled as I added more features, so I had to be </w:t>
+      </w:r>
+      <w:proofErr w:type="gramStart"/>
+      <w:r>
+        <w:rPr>
+          <w:rFonts w:ascii="Calibri" w:hAnsi="Calibri" w:cs="Calibri"/>
+        </w:rPr>
+        <w:t>really thoughtful</w:t>
+      </w:r>
+      <w:proofErr w:type="gramEnd"/>
+      <w:r>
+        <w:rPr>
+          <w:rFonts w:ascii="Calibri" w:hAnsi="Calibri" w:cs="Calibri"/>
+        </w:rPr>
+        <w:t xml:space="preserve"> about enforcing separation of concerns and keeping functions focused and cohesive, </w:t>
       </w:r>
     </w:p>
     <w:p>
@@ -507,6 +609,356 @@
         </w:rPr>
         <w:t xml:space="preserve">. </w:t>
       </w:r>
+    </w:p>
+    <w:p>
+      <w:pPr>
+        <w:ind w:firstLine="720"/>
+        <w:rPr>
+          <w:rFonts w:ascii="Calibri" w:hAnsi="Calibri" w:cs="Calibri"/>
+        </w:rPr>
+      </w:pPr>
+    </w:p>
+    <w:p>
+      <w:pPr>
+        <w:ind w:firstLine="720"/>
+        <w:jc w:val="center"/>
+        <w:rPr>
+          <w:rFonts w:ascii="Calibri" w:hAnsi="Calibri" w:cs="Calibri"/>
+          <w:b/>
+          <w:bCs/>
+          <w:u w:val="single"/>
+        </w:rPr>
+      </w:pPr>
+      <w:r>
+        <w:rPr>
+          <w:rFonts w:ascii="Calibri" w:hAnsi="Calibri" w:cs="Calibri"/>
+          <w:b/>
+          <w:bCs/>
+          <w:u w:val="single"/>
+        </w:rPr>
+        <w:lastRenderedPageBreak/>
+        <w:t>Screenshots</w:t>
+      </w:r>
+    </w:p>
+    <w:p>
+      <w:pPr>
+        <w:ind w:firstLine="720"/>
+        <w:rPr>
+          <w:rFonts w:ascii="Calibri" w:hAnsi="Calibri" w:cs="Calibri"/>
+          <w:b/>
+          <w:bCs/>
+        </w:rPr>
+      </w:pPr>
+      <w:r>
+        <w:rPr>
+          <w:rFonts w:ascii="Calibri" w:hAnsi="Calibri" w:cs="Calibri"/>
+          <w:b/>
+          <w:bCs/>
+        </w:rPr>
+        <w:t xml:space="preserve">Here is a sample of one of my Pet Repository data </w:t>
+      </w:r>
+      <w:proofErr w:type="gramStart"/>
+      <w:r>
+        <w:rPr>
+          <w:rFonts w:ascii="Calibri" w:hAnsi="Calibri" w:cs="Calibri"/>
+          <w:b/>
+          <w:bCs/>
+        </w:rPr>
+        <w:t>structure</w:t>
+      </w:r>
+      <w:proofErr w:type="gramEnd"/>
+      <w:r>
+        <w:rPr>
+          <w:rFonts w:ascii="Calibri" w:hAnsi="Calibri" w:cs="Calibri"/>
+          <w:b/>
+          <w:bCs/>
+        </w:rPr>
+        <w:t xml:space="preserve">. Here is where the </w:t>
+      </w:r>
+      <w:proofErr w:type="spellStart"/>
+      <w:r>
+        <w:rPr>
+          <w:rFonts w:ascii="Calibri" w:hAnsi="Calibri" w:cs="Calibri"/>
+          <w:b/>
+          <w:bCs/>
+        </w:rPr>
+        <w:t>ArrayList</w:t>
+      </w:r>
+      <w:proofErr w:type="spellEnd"/>
+      <w:r>
+        <w:rPr>
+          <w:rFonts w:ascii="Calibri" w:hAnsi="Calibri" w:cs="Calibri"/>
+          <w:b/>
+          <w:bCs/>
+        </w:rPr>
+        <w:t xml:space="preserve"> and HashMap are kept, the Owner and Stays one mimic this one.  </w:t>
+      </w:r>
+    </w:p>
+    <w:p>
+      <w:pPr>
+        <w:ind w:firstLine="720"/>
+        <w:rPr>
+          <w:rFonts w:ascii="Calibri" w:hAnsi="Calibri" w:cs="Calibri"/>
+          <w:b/>
+          <w:bCs/>
+        </w:rPr>
+      </w:pPr>
+      <w:r>
+        <w:rPr>
+          <w:rFonts w:ascii="Calibri" w:hAnsi="Calibri" w:cs="Calibri"/>
+          <w:b/>
+          <w:bCs/>
+        </w:rPr>
+        <w:drawing>
+          <wp:inline distT="0" distB="0" distL="0" distR="0" wp14:anchorId="7B688A1D" wp14:editId="5C67DD6A">
+            <wp:extent cx="5943600" cy="6746875"/>
+            <wp:effectExtent l="0" t="0" r="0" b="0"/>
+            <wp:docPr id="1460134536" name="Picture 1"/>
+            <wp:cNvGraphicFramePr>
+              <a:graphicFrameLocks xmlns:a="http://schemas.openxmlformats.org/drawingml/2006/main" noChangeAspect="1"/>
+            </wp:cNvGraphicFramePr>
+            <a:graphic xmlns:a="http://schemas.openxmlformats.org/drawingml/2006/main">
+              <a:graphicData uri="http://schemas.openxmlformats.org/drawingml/2006/picture">
+                <pic:pic xmlns:pic="http://schemas.openxmlformats.org/drawingml/2006/picture">
+                  <pic:nvPicPr>
+                    <pic:cNvPr id="1460134536" name=""/>
+                    <pic:cNvPicPr/>
+                  </pic:nvPicPr>
+                  <pic:blipFill>
+                    <a:blip r:embed="rId5"/>
+                    <a:stretch>
+                      <a:fillRect/>
+                    </a:stretch>
+                  </pic:blipFill>
+                  <pic:spPr>
+                    <a:xfrm>
+                      <a:off x="0" y="0"/>
+                      <a:ext cx="5943600" cy="6746875"/>
+                    </a:xfrm>
+                    <a:prstGeom prst="rect">
+                      <a:avLst/>
+                    </a:prstGeom>
+                  </pic:spPr>
+                </pic:pic>
+              </a:graphicData>
+            </a:graphic>
+          </wp:inline>
+        </w:drawing>
+      </w:r>
+    </w:p>
+    <w:p>
+      <w:pPr>
+        <w:rPr>
+          <w:rFonts w:ascii="Calibri" w:hAnsi="Calibri" w:cs="Calibri"/>
+          <w:b/>
+          <w:bCs/>
+        </w:rPr>
+      </w:pPr>
+    </w:p>
+    <w:p>
+      <w:pPr>
+        <w:rPr>
+          <w:rFonts w:ascii="Calibri" w:hAnsi="Calibri" w:cs="Calibri"/>
+          <w:b/>
+          <w:bCs/>
+        </w:rPr>
+      </w:pPr>
+      <w:r>
+        <w:rPr>
+          <w:rFonts w:ascii="Calibri" w:hAnsi="Calibri" w:cs="Calibri"/>
+          <w:b/>
+          <w:bCs/>
+        </w:rPr>
+        <w:lastRenderedPageBreak/>
+        <w:t xml:space="preserve">Here is a screenshot of my </w:t>
+      </w:r>
+      <w:proofErr w:type="spellStart"/>
+      <w:r>
+        <w:rPr>
+          <w:rFonts w:ascii="Calibri" w:hAnsi="Calibri" w:cs="Calibri"/>
+          <w:b/>
+          <w:bCs/>
+        </w:rPr>
+        <w:t>SortUtil</w:t>
+      </w:r>
+      <w:proofErr w:type="spellEnd"/>
+      <w:r>
+        <w:rPr>
+          <w:rFonts w:ascii="Calibri" w:hAnsi="Calibri" w:cs="Calibri"/>
+          <w:b/>
+          <w:bCs/>
+        </w:rPr>
+        <w:t xml:space="preserve">. This is where I keep my merge sort algorithm, I kept it generic using </w:t>
+      </w:r>
+      <w:proofErr w:type="spellStart"/>
+      <w:r>
+        <w:rPr>
+          <w:rFonts w:ascii="Calibri" w:hAnsi="Calibri" w:cs="Calibri"/>
+          <w:b/>
+          <w:bCs/>
+        </w:rPr>
+        <w:t>ArrayList</w:t>
+      </w:r>
+      <w:proofErr w:type="spellEnd"/>
+      <w:r>
+        <w:rPr>
+          <w:rFonts w:ascii="Calibri" w:hAnsi="Calibri" w:cs="Calibri"/>
+          <w:b/>
+          <w:bCs/>
+        </w:rPr>
+        <w:t>&lt;T&gt; and using Comparators so that I can sort by any passed column</w:t>
+      </w:r>
+    </w:p>
+    <w:p>
+      <w:pPr>
+        <w:ind w:firstLine="720"/>
+        <w:rPr>
+          <w:rFonts w:ascii="Calibri" w:hAnsi="Calibri" w:cs="Calibri"/>
+          <w:b/>
+          <w:bCs/>
+        </w:rPr>
+      </w:pPr>
+      <w:r>
+        <w:rPr>
+          <w:rFonts w:ascii="Calibri" w:hAnsi="Calibri" w:cs="Calibri"/>
+          <w:b/>
+          <w:bCs/>
+        </w:rPr>
+        <w:drawing>
+          <wp:inline distT="0" distB="0" distL="0" distR="0" wp14:anchorId="7E3B5DDB" wp14:editId="517103E7">
+            <wp:extent cx="5943600" cy="7479030"/>
+            <wp:effectExtent l="0" t="0" r="0" b="7620"/>
+            <wp:docPr id="1885419167" name="Picture 1"/>
+            <wp:cNvGraphicFramePr>
+              <a:graphicFrameLocks xmlns:a="http://schemas.openxmlformats.org/drawingml/2006/main" noChangeAspect="1"/>
+            </wp:cNvGraphicFramePr>
+            <a:graphic xmlns:a="http://schemas.openxmlformats.org/drawingml/2006/main">
+              <a:graphicData uri="http://schemas.openxmlformats.org/drawingml/2006/picture">
+                <pic:pic xmlns:pic="http://schemas.openxmlformats.org/drawingml/2006/picture">
+                  <pic:nvPicPr>
+                    <pic:cNvPr id="1885419167" name=""/>
+                    <pic:cNvPicPr/>
+                  </pic:nvPicPr>
+                  <pic:blipFill>
+                    <a:blip r:embed="rId6"/>
+                    <a:stretch>
+                      <a:fillRect/>
+                    </a:stretch>
+                  </pic:blipFill>
+                  <pic:spPr>
+                    <a:xfrm>
+                      <a:off x="0" y="0"/>
+                      <a:ext cx="5943600" cy="7479030"/>
+                    </a:xfrm>
+                    <a:prstGeom prst="rect">
+                      <a:avLst/>
+                    </a:prstGeom>
+                  </pic:spPr>
+                </pic:pic>
+              </a:graphicData>
+            </a:graphic>
+          </wp:inline>
+        </w:drawing>
+      </w:r>
+    </w:p>
+    <w:p>
+      <w:pPr>
+        <w:ind w:firstLine="720"/>
+        <w:rPr>
+          <w:rFonts w:ascii="Calibri" w:hAnsi="Calibri" w:cs="Calibri"/>
+          <w:b/>
+          <w:bCs/>
+        </w:rPr>
+      </w:pPr>
+      <w:r>
+        <w:rPr>
+          <w:rFonts w:ascii="Calibri" w:hAnsi="Calibri" w:cs="Calibri"/>
+          <w:b/>
+          <w:bCs/>
+        </w:rPr>
+        <w:lastRenderedPageBreak/>
+        <w:t xml:space="preserve">This is the Stay Repository data structure, I include this one here, because this is where I used a binary search insertion algorithm to sort the current stays by check-in date. This structure serves the purpose of populating the </w:t>
+      </w:r>
+      <w:proofErr w:type="gramStart"/>
+      <w:r>
+        <w:rPr>
+          <w:rFonts w:ascii="Calibri" w:hAnsi="Calibri" w:cs="Calibri"/>
+          <w:b/>
+          <w:bCs/>
+        </w:rPr>
+        <w:t>in progress</w:t>
+      </w:r>
+      <w:proofErr w:type="gramEnd"/>
+      <w:r>
+        <w:rPr>
+          <w:rFonts w:ascii="Calibri" w:hAnsi="Calibri" w:cs="Calibri"/>
+          <w:b/>
+          <w:bCs/>
+        </w:rPr>
+        <w:t xml:space="preserve"> stays, not the entirety of the stays table</w:t>
+      </w:r>
+    </w:p>
+    <w:p>
+      <w:pPr>
+        <w:ind w:firstLine="720"/>
+        <w:rPr>
+          <w:rFonts w:ascii="Calibri" w:hAnsi="Calibri" w:cs="Calibri"/>
+          <w:b/>
+          <w:bCs/>
+        </w:rPr>
+      </w:pPr>
+      <w:r>
+        <w:rPr>
+          <w:rFonts w:ascii="Calibri" w:hAnsi="Calibri" w:cs="Calibri"/>
+          <w:b/>
+          <w:bCs/>
+        </w:rPr>
+        <w:drawing>
+          <wp:inline distT="0" distB="0" distL="0" distR="0" wp14:anchorId="39F0D386" wp14:editId="4610BF22">
+            <wp:extent cx="5943600" cy="7064375"/>
+            <wp:effectExtent l="0" t="0" r="0" b="3175"/>
+            <wp:docPr id="296045074" name="Picture 1"/>
+            <wp:cNvGraphicFramePr>
+              <a:graphicFrameLocks xmlns:a="http://schemas.openxmlformats.org/drawingml/2006/main" noChangeAspect="1"/>
+            </wp:cNvGraphicFramePr>
+            <a:graphic xmlns:a="http://schemas.openxmlformats.org/drawingml/2006/main">
+              <a:graphicData uri="http://schemas.openxmlformats.org/drawingml/2006/picture">
+                <pic:pic xmlns:pic="http://schemas.openxmlformats.org/drawingml/2006/picture">
+                  <pic:nvPicPr>
+                    <pic:cNvPr id="296045074" name=""/>
+                    <pic:cNvPicPr/>
+                  </pic:nvPicPr>
+                  <pic:blipFill>
+                    <a:blip r:embed="rId7"/>
+                    <a:stretch>
+                      <a:fillRect/>
+                    </a:stretch>
+                  </pic:blipFill>
+                  <pic:spPr>
+                    <a:xfrm>
+                      <a:off x="0" y="0"/>
+                      <a:ext cx="5943600" cy="7064375"/>
+                    </a:xfrm>
+                    <a:prstGeom prst="rect">
+                      <a:avLst/>
+                    </a:prstGeom>
+                  </pic:spPr>
+                </pic:pic>
+              </a:graphicData>
+            </a:graphic>
+          </wp:inline>
+        </w:drawing>
+      </w:r>
+    </w:p>
+    <w:p>
+      <w:pPr>
+        <w:ind w:firstLine="720"/>
+        <w:rPr>
+          <w:rFonts w:ascii="Calibri" w:hAnsi="Calibri" w:cs="Calibri"/>
+          <w:b/>
+          <w:bCs/>
+        </w:rPr>
+      </w:pPr>
     </w:p>
     <w:sectPr>
       <w:pgSz w:w="12240" w:h="15840"/>
@@ -1250,6 +1702,7 @@
   <w:style w:type="character" w:default="1" w:styleId="DefaultParagraphFont">
     <w:name w:val="Default Paragraph Font"/>
     <w:uiPriority w:val="1"/>
+    <w:semiHidden/>
     <w:unhideWhenUsed/>
   </w:style>
   <w:style w:type="table" w:default="1" w:styleId="TableNormal">

</xml_diff>